<commit_message>
Alinha o documento com a regua nova de SLA
Adiciona a secao SLA por frente ao .docx, no mesmo padrao de tabela do
documento, e corrige a evolucao S16-S17 para a base coorte: resolucao
72% -> 92% (+20 p.p.) e 1a resposta 95% -> 100% (+5 p.p.).

Inclui a nota de metodo e o registro da revisao, para explicar por que os
numeros diferem da versao enviada anteriormente. Documento e painel passam
a contar a mesma historia.

Co-Authored-By: Claude Opus 5 (1M context) <noreply@anthropic.com>
</commit_message>
<xml_diff>
--- a/agosto-2026/Report_Mensal_TI_Agosto_2026.docx
+++ b/agosto-2026/Report_Mensal_TI_Agosto_2026.docx
@@ -843,7 +843,7 @@
                 <w:sz w:val="18"/>
                 <w:szCs w:val="18"/>
               </w:rPr>
-              <w:t xml:space="preserve">91%</w:t>
+              <w:t xml:space="preserve">95%</w:t>
             </w:r>
           </w:p>
         </w:tc>
@@ -909,7 +909,7 @@
                 <w:sz w:val="18"/>
                 <w:szCs w:val="18"/>
               </w:rPr>
-              <w:t xml:space="preserve">▲ +9 p.p.</w:t>
+              <w:t xml:space="preserve">▲ +5 p.p.</w:t>
             </w:r>
           </w:p>
         </w:tc>
@@ -977,7 +977,7 @@
                 <w:sz w:val="18"/>
                 <w:szCs w:val="18"/>
               </w:rPr>
-              <w:t xml:space="preserve">78%</w:t>
+              <w:t xml:space="preserve">72%</w:t>
             </w:r>
           </w:p>
         </w:tc>
@@ -1010,7 +1010,7 @@
                 <w:sz w:val="18"/>
                 <w:szCs w:val="18"/>
               </w:rPr>
-              <w:t xml:space="preserve">91%</w:t>
+              <w:t xml:space="preserve">92%</w:t>
             </w:r>
           </w:p>
         </w:tc>
@@ -1043,7 +1043,7 @@
                 <w:sz w:val="18"/>
                 <w:szCs w:val="18"/>
               </w:rPr>
-              <w:t xml:space="preserve">▲ +13 p.p.</w:t>
+              <w:t xml:space="preserve">▲ +20 p.p.</w:t>
             </w:r>
           </w:p>
         </w:tc>
@@ -1066,7 +1066,7 @@
           <w:sz w:val="21"/>
           <w:szCs w:val="21"/>
         </w:rPr>
-        <w:t xml:space="preserve">A leitura estratégica: a Tecnologia aumentou a capacidade de entrega (mais itens concluídos) e, ao mesmo tempo, elevou a qualidade do atendimento (SLA de resolução de 78% para 91%). Crescer volume e qualidade juntos é sinal de maturidade operacional, não de esforço pontual.</w:t>
+        <w:t xml:space="preserve">A leitura estratégica: a Tecnologia aumentou a capacidade de entrega (mais itens concluídos) e, ao mesmo tempo, elevou a qualidade do atendimento (SLA de resolução de 72% para 92%). Crescer volume e qualidade juntos é sinal de maturidade operacional, não de esforço pontual.</w:t>
       </w:r>
     </w:p>
     <w:p>
@@ -1083,6 +1083,946 @@
           <w:sz w:val="21"/>
           <w:szCs w:val="21"/>
         </w:rPr>
+        <w:t xml:space="preserve">  SLA por frente (trilhas do Service Desk)</w:t>
+      </w:r>
+    </w:p>
+    <w:p>
+      <w:pPr>
+        <w:spacing w:after="80"/>
+        <w:jc w:val="both"/>
+      </w:pPr>
+      <w:r>
+        <w:rPr>
+          <w:rFonts w:ascii="Exo 2" w:cs="Exo 2" w:eastAsia="Exo 2" w:hAnsi="Exo 2"/>
+          <w:color w:val="1A1A1A"/>
+          <w:sz w:val="21"/>
+          <w:szCs w:val="21"/>
+        </w:rPr>
+        <w:t xml:space="preserve">O número agregado esconde onde está o esforço. Abaixo, o cumprimento de SLA por trilha de atendimento do Service Desk, lido direto dos campos oficiais do Jira Service Management, em horário comercial. A primeira resposta está sob controle em todas as frentes; a diferença aparece na resolução.</w:t>
+      </w:r>
+    </w:p>
+    <w:tbl>
+      <w:tblPr>
+        <w:tblW w:type="pct" w:w="100%"/>
+        <w:tblBorders>
+          <w:top w:val="single" w:color="auto" w:sz="4"/>
+          <w:left w:val="single" w:color="auto" w:sz="4"/>
+          <w:bottom w:val="single" w:color="auto" w:sz="4"/>
+          <w:right w:val="single" w:color="auto" w:sz="4"/>
+          <w:insideH w:val="single" w:color="auto" w:sz="4"/>
+          <w:insideV w:val="single" w:color="auto" w:sz="4"/>
+        </w:tblBorders>
+      </w:tblPr>
+      <w:tblGrid>
+        <w:gridCol w:w="100"/>
+        <w:gridCol w:w="100"/>
+        <w:gridCol w:w="100"/>
+        <w:gridCol w:w="100"/>
+        <w:gridCol w:w="100"/>
+      </w:tblGrid>
+      <w:tr>
+        <w:tc>
+          <w:tcPr>
+            <w:tcW w:type="pct" w:w="30%"/>
+            <w:shd w:fill="002060" w:val="clear"/>
+            <w:tcMar>
+              <w:top w:type="dxa" w:w="60"/>
+              <w:left w:type="dxa" w:w="100"/>
+              <w:bottom w:type="dxa" w:w="60"/>
+              <w:right w:type="dxa" w:w="100"/>
+            </w:tcMar>
+          </w:tcPr>
+          <w:p>
+            <w:pPr>
+              <w:jc w:val="left"/>
+            </w:pPr>
+            <w:r>
+              <w:rPr>
+                <w:rFonts w:ascii="Exo 2" w:cs="Exo 2" w:eastAsia="Exo 2" w:hAnsi="Exo 2"/>
+                <w:b/>
+                <w:bCs/>
+                <w:color w:val="FFFFFF"/>
+                <w:sz w:val="17"/>
+                <w:szCs w:val="17"/>
+              </w:rPr>
+              <w:t xml:space="preserve">Frente</w:t>
+            </w:r>
+          </w:p>
+        </w:tc>
+        <w:tc>
+          <w:tcPr>
+            <w:tcW w:type="pct" w:w="13%"/>
+            <w:shd w:fill="002060" w:val="clear"/>
+            <w:tcMar>
+              <w:top w:type="dxa" w:w="60"/>
+              <w:left w:type="dxa" w:w="100"/>
+              <w:bottom w:type="dxa" w:w="60"/>
+              <w:right w:type="dxa" w:w="100"/>
+            </w:tcMar>
+          </w:tcPr>
+          <w:p>
+            <w:pPr>
+              <w:jc w:val="center"/>
+            </w:pPr>
+            <w:r>
+              <w:rPr>
+                <w:rFonts w:ascii="Exo 2" w:cs="Exo 2" w:eastAsia="Exo 2" w:hAnsi="Exo 2"/>
+                <w:b/>
+                <w:bCs/>
+                <w:color w:val="FFFFFF"/>
+                <w:sz w:val="17"/>
+                <w:szCs w:val="17"/>
+              </w:rPr>
+              <w:t xml:space="preserve">Meta</w:t>
+            </w:r>
+          </w:p>
+        </w:tc>
+        <w:tc>
+          <w:tcPr>
+            <w:tcW w:type="pct" w:w="23%"/>
+            <w:shd w:fill="002060" w:val="clear"/>
+            <w:tcMar>
+              <w:top w:type="dxa" w:w="60"/>
+              <w:left w:type="dxa" w:w="100"/>
+              <w:bottom w:type="dxa" w:w="60"/>
+              <w:right w:type="dxa" w:w="100"/>
+            </w:tcMar>
+          </w:tcPr>
+          <w:p>
+            <w:pPr>
+              <w:jc w:val="left"/>
+            </w:pPr>
+            <w:r>
+              <w:rPr>
+                <w:rFonts w:ascii="Exo 2" w:cs="Exo 2" w:eastAsia="Exo 2" w:hAnsi="Exo 2"/>
+                <w:b/>
+                <w:bCs/>
+                <w:color w:val="FFFFFF"/>
+                <w:sz w:val="17"/>
+                <w:szCs w:val="17"/>
+              </w:rPr>
+              <w:t xml:space="preserve">Chamados</w:t>
+            </w:r>
+          </w:p>
+        </w:tc>
+        <w:tc>
+          <w:tcPr>
+            <w:tcW w:type="pct" w:w="17%"/>
+            <w:shd w:fill="002060" w:val="clear"/>
+            <w:tcMar>
+              <w:top w:type="dxa" w:w="60"/>
+              <w:left w:type="dxa" w:w="100"/>
+              <w:bottom w:type="dxa" w:w="60"/>
+              <w:right w:type="dxa" w:w="100"/>
+            </w:tcMar>
+          </w:tcPr>
+          <w:p>
+            <w:pPr>
+              <w:jc w:val="center"/>
+            </w:pPr>
+            <w:r>
+              <w:rPr>
+                <w:rFonts w:ascii="Exo 2" w:cs="Exo 2" w:eastAsia="Exo 2" w:hAnsi="Exo 2"/>
+                <w:b/>
+                <w:bCs/>
+                <w:color w:val="FFFFFF"/>
+                <w:sz w:val="17"/>
+                <w:szCs w:val="17"/>
+              </w:rPr>
+              <w:t xml:space="preserve">Resolução no prazo</w:t>
+            </w:r>
+          </w:p>
+        </w:tc>
+        <w:tc>
+          <w:tcPr>
+            <w:tcW w:type="pct" w:w="17%"/>
+            <w:shd w:fill="002060" w:val="clear"/>
+            <w:tcMar>
+              <w:top w:type="dxa" w:w="60"/>
+              <w:left w:type="dxa" w:w="100"/>
+              <w:bottom w:type="dxa" w:w="60"/>
+              <w:right w:type="dxa" w:w="100"/>
+            </w:tcMar>
+          </w:tcPr>
+          <w:p>
+            <w:pPr>
+              <w:jc w:val="center"/>
+            </w:pPr>
+            <w:r>
+              <w:rPr>
+                <w:rFonts w:ascii="Exo 2" w:cs="Exo 2" w:eastAsia="Exo 2" w:hAnsi="Exo 2"/>
+                <w:b/>
+                <w:bCs/>
+                <w:color w:val="FFFFFF"/>
+                <w:sz w:val="17"/>
+                <w:szCs w:val="17"/>
+              </w:rPr>
+              <w:t xml:space="preserve">1ª resposta</w:t>
+            </w:r>
+          </w:p>
+        </w:tc>
+      </w:tr>
+      <w:tr>
+        <w:tc>
+          <w:tcPr>
+            <w:tcW w:type="pct" w:w="30%"/>
+            <w:tcBorders>
+              <w:top w:val="single" w:color="C9D2E3" w:sz="4"/>
+              <w:left w:val="single" w:color="C9D2E3" w:sz="4"/>
+              <w:bottom w:val="single" w:color="C9D2E3" w:sz="4"/>
+              <w:right w:val="single" w:color="C9D2E3" w:sz="4"/>
+            </w:tcBorders>
+            <w:tcMar>
+              <w:top w:type="dxa" w:w="50"/>
+              <w:left w:type="dxa" w:w="100"/>
+              <w:bottom w:type="dxa" w:w="50"/>
+              <w:right w:type="dxa" w:w="100"/>
+            </w:tcMar>
+          </w:tcPr>
+          <w:p>
+            <w:pPr>
+              <w:jc w:val="left"/>
+            </w:pPr>
+            <w:r>
+              <w:rPr>
+                <w:rFonts w:ascii="Exo 2" w:cs="Exo 2" w:eastAsia="Exo 2" w:hAnsi="Exo 2"/>
+                <w:b w:val="false"/>
+                <w:bCs w:val="false"/>
+                <w:color w:val="1A1A1A"/>
+                <w:sz w:val="18"/>
+                <w:szCs w:val="18"/>
+              </w:rPr>
+              <w:t xml:space="preserve">Solicitação de TI</w:t>
+            </w:r>
+          </w:p>
+        </w:tc>
+        <w:tc>
+          <w:tcPr>
+            <w:tcW w:type="pct" w:w="13%"/>
+            <w:tcBorders>
+              <w:top w:val="single" w:color="C9D2E3" w:sz="4"/>
+              <w:left w:val="single" w:color="C9D2E3" w:sz="4"/>
+              <w:bottom w:val="single" w:color="C9D2E3" w:sz="4"/>
+              <w:right w:val="single" w:color="C9D2E3" w:sz="4"/>
+            </w:tcBorders>
+            <w:tcMar>
+              <w:top w:type="dxa" w:w="50"/>
+              <w:left w:type="dxa" w:w="100"/>
+              <w:bottom w:type="dxa" w:w="50"/>
+              <w:right w:type="dxa" w:w="100"/>
+            </w:tcMar>
+          </w:tcPr>
+          <w:p>
+            <w:pPr>
+              <w:jc w:val="center"/>
+            </w:pPr>
+            <w:r>
+              <w:rPr>
+                <w:rFonts w:ascii="Exo 2" w:cs="Exo 2" w:eastAsia="Exo 2" w:hAnsi="Exo 2"/>
+                <w:b w:val="false"/>
+                <w:bCs w:val="false"/>
+                <w:color w:val="1A1A1A"/>
+                <w:sz w:val="18"/>
+                <w:szCs w:val="18"/>
+              </w:rPr>
+              <w:t xml:space="preserve">4h / 24h</w:t>
+            </w:r>
+          </w:p>
+        </w:tc>
+        <w:tc>
+          <w:tcPr>
+            <w:tcW w:type="pct" w:w="23%"/>
+            <w:tcBorders>
+              <w:top w:val="single" w:color="C9D2E3" w:sz="4"/>
+              <w:left w:val="single" w:color="C9D2E3" w:sz="4"/>
+              <w:bottom w:val="single" w:color="C9D2E3" w:sz="4"/>
+              <w:right w:val="single" w:color="C9D2E3" w:sz="4"/>
+            </w:tcBorders>
+            <w:tcMar>
+              <w:top w:type="dxa" w:w="50"/>
+              <w:left w:type="dxa" w:w="100"/>
+              <w:bottom w:type="dxa" w:w="50"/>
+              <w:right w:type="dxa" w:w="100"/>
+            </w:tcMar>
+          </w:tcPr>
+          <w:p>
+            <w:pPr>
+              <w:jc w:val="left"/>
+            </w:pPr>
+            <w:r>
+              <w:rPr>
+                <w:rFonts w:ascii="Exo 2" w:cs="Exo 2" w:eastAsia="Exo 2" w:hAnsi="Exo 2"/>
+                <w:b w:val="false"/>
+                <w:bCs w:val="false"/>
+                <w:color w:val="1A1A1A"/>
+                <w:sz w:val="18"/>
+                <w:szCs w:val="18"/>
+              </w:rPr>
+              <w:t xml:space="preserve">25 recebidos · 21 concluídos · 4 em aberto</w:t>
+            </w:r>
+          </w:p>
+        </w:tc>
+        <w:tc>
+          <w:tcPr>
+            <w:tcW w:type="pct" w:w="17%"/>
+            <w:tcBorders>
+              <w:top w:val="single" w:color="C9D2E3" w:sz="4"/>
+              <w:left w:val="single" w:color="C9D2E3" w:sz="4"/>
+              <w:bottom w:val="single" w:color="C9D2E3" w:sz="4"/>
+              <w:right w:val="single" w:color="C9D2E3" w:sz="4"/>
+            </w:tcBorders>
+            <w:tcMar>
+              <w:top w:type="dxa" w:w="50"/>
+              <w:left w:type="dxa" w:w="100"/>
+              <w:bottom w:type="dxa" w:w="50"/>
+              <w:right w:type="dxa" w:w="100"/>
+            </w:tcMar>
+          </w:tcPr>
+          <w:p>
+            <w:pPr>
+              <w:jc w:val="center"/>
+            </w:pPr>
+            <w:r>
+              <w:rPr>
+                <w:rFonts w:ascii="Exo 2" w:cs="Exo 2" w:eastAsia="Exo 2" w:hAnsi="Exo 2"/>
+                <w:b w:val="false"/>
+                <w:bCs w:val="false"/>
+                <w:color w:val="1A1A1A"/>
+                <w:sz w:val="18"/>
+                <w:szCs w:val="18"/>
+              </w:rPr>
+              <w:t xml:space="preserve">85,7%  (18 de 21)</w:t>
+            </w:r>
+          </w:p>
+        </w:tc>
+        <w:tc>
+          <w:tcPr>
+            <w:tcW w:type="pct" w:w="17%"/>
+            <w:tcBorders>
+              <w:top w:val="single" w:color="C9D2E3" w:sz="4"/>
+              <w:left w:val="single" w:color="C9D2E3" w:sz="4"/>
+              <w:bottom w:val="single" w:color="C9D2E3" w:sz="4"/>
+              <w:right w:val="single" w:color="C9D2E3" w:sz="4"/>
+            </w:tcBorders>
+            <w:tcMar>
+              <w:top w:type="dxa" w:w="50"/>
+              <w:left w:type="dxa" w:w="100"/>
+              <w:bottom w:type="dxa" w:w="50"/>
+              <w:right w:type="dxa" w:w="100"/>
+            </w:tcMar>
+          </w:tcPr>
+          <w:p>
+            <w:pPr>
+              <w:jc w:val="center"/>
+            </w:pPr>
+            <w:r>
+              <w:rPr>
+                <w:rFonts w:ascii="Exo 2" w:cs="Exo 2" w:eastAsia="Exo 2" w:hAnsi="Exo 2"/>
+                <w:b w:val="false"/>
+                <w:bCs w:val="false"/>
+                <w:color w:val="1A1A1A"/>
+                <w:sz w:val="18"/>
+                <w:szCs w:val="18"/>
+              </w:rPr>
+              <w:t xml:space="preserve">100%</w:t>
+            </w:r>
+          </w:p>
+        </w:tc>
+      </w:tr>
+      <w:tr>
+        <w:tc>
+          <w:tcPr>
+            <w:tcW w:type="pct" w:w="30%"/>
+            <w:tcBorders>
+              <w:top w:val="single" w:color="C9D2E3" w:sz="4"/>
+              <w:left w:val="single" w:color="C9D2E3" w:sz="4"/>
+              <w:bottom w:val="single" w:color="C9D2E3" w:sz="4"/>
+              <w:right w:val="single" w:color="C9D2E3" w:sz="4"/>
+            </w:tcBorders>
+            <w:tcMar>
+              <w:top w:type="dxa" w:w="50"/>
+              <w:left w:type="dxa" w:w="100"/>
+              <w:bottom w:type="dxa" w:w="50"/>
+              <w:right w:type="dxa" w:w="100"/>
+            </w:tcMar>
+          </w:tcPr>
+          <w:p>
+            <w:pPr>
+              <w:jc w:val="left"/>
+            </w:pPr>
+            <w:r>
+              <w:rPr>
+                <w:rFonts w:ascii="Exo 2" w:cs="Exo 2" w:eastAsia="Exo 2" w:hAnsi="Exo 2"/>
+                <w:b w:val="false"/>
+                <w:bCs w:val="false"/>
+                <w:color w:val="1A1A1A"/>
+                <w:sz w:val="18"/>
+                <w:szCs w:val="18"/>
+              </w:rPr>
+              <w:t xml:space="preserve">Solicitação – Comunicação Digital</w:t>
+            </w:r>
+          </w:p>
+        </w:tc>
+        <w:tc>
+          <w:tcPr>
+            <w:tcW w:type="pct" w:w="13%"/>
+            <w:tcBorders>
+              <w:top w:val="single" w:color="C9D2E3" w:sz="4"/>
+              <w:left w:val="single" w:color="C9D2E3" w:sz="4"/>
+              <w:bottom w:val="single" w:color="C9D2E3" w:sz="4"/>
+              <w:right w:val="single" w:color="C9D2E3" w:sz="4"/>
+            </w:tcBorders>
+            <w:tcMar>
+              <w:top w:type="dxa" w:w="50"/>
+              <w:left w:type="dxa" w:w="100"/>
+              <w:bottom w:type="dxa" w:w="50"/>
+              <w:right w:type="dxa" w:w="100"/>
+            </w:tcMar>
+          </w:tcPr>
+          <w:p>
+            <w:pPr>
+              <w:jc w:val="center"/>
+            </w:pPr>
+            <w:r>
+              <w:rPr>
+                <w:rFonts w:ascii="Exo 2" w:cs="Exo 2" w:eastAsia="Exo 2" w:hAnsi="Exo 2"/>
+                <w:b w:val="false"/>
+                <w:bCs w:val="false"/>
+                <w:color w:val="1A1A1A"/>
+                <w:sz w:val="18"/>
+                <w:szCs w:val="18"/>
+              </w:rPr>
+              <w:t xml:space="preserve">4h / 56h</w:t>
+            </w:r>
+          </w:p>
+        </w:tc>
+        <w:tc>
+          <w:tcPr>
+            <w:tcW w:type="pct" w:w="23%"/>
+            <w:tcBorders>
+              <w:top w:val="single" w:color="C9D2E3" w:sz="4"/>
+              <w:left w:val="single" w:color="C9D2E3" w:sz="4"/>
+              <w:bottom w:val="single" w:color="C9D2E3" w:sz="4"/>
+              <w:right w:val="single" w:color="C9D2E3" w:sz="4"/>
+            </w:tcBorders>
+            <w:tcMar>
+              <w:top w:type="dxa" w:w="50"/>
+              <w:left w:type="dxa" w:w="100"/>
+              <w:bottom w:type="dxa" w:w="50"/>
+              <w:right w:type="dxa" w:w="100"/>
+            </w:tcMar>
+          </w:tcPr>
+          <w:p>
+            <w:pPr>
+              <w:jc w:val="left"/>
+            </w:pPr>
+            <w:r>
+              <w:rPr>
+                <w:rFonts w:ascii="Exo 2" w:cs="Exo 2" w:eastAsia="Exo 2" w:hAnsi="Exo 2"/>
+                <w:b w:val="false"/>
+                <w:bCs w:val="false"/>
+                <w:color w:val="1A1A1A"/>
+                <w:sz w:val="18"/>
+                <w:szCs w:val="18"/>
+              </w:rPr>
+              <w:t xml:space="preserve">15 recebidos · 8 concluídos · 7 em aberto</w:t>
+            </w:r>
+          </w:p>
+        </w:tc>
+        <w:tc>
+          <w:tcPr>
+            <w:tcW w:type="pct" w:w="17%"/>
+            <w:tcBorders>
+              <w:top w:val="single" w:color="C9D2E3" w:sz="4"/>
+              <w:left w:val="single" w:color="C9D2E3" w:sz="4"/>
+              <w:bottom w:val="single" w:color="C9D2E3" w:sz="4"/>
+              <w:right w:val="single" w:color="C9D2E3" w:sz="4"/>
+            </w:tcBorders>
+            <w:tcMar>
+              <w:top w:type="dxa" w:w="50"/>
+              <w:left w:type="dxa" w:w="100"/>
+              <w:bottom w:type="dxa" w:w="50"/>
+              <w:right w:type="dxa" w:w="100"/>
+            </w:tcMar>
+          </w:tcPr>
+          <w:p>
+            <w:pPr>
+              <w:jc w:val="center"/>
+            </w:pPr>
+            <w:r>
+              <w:rPr>
+                <w:rFonts w:ascii="Exo 2" w:cs="Exo 2" w:eastAsia="Exo 2" w:hAnsi="Exo 2"/>
+                <w:b w:val="false"/>
+                <w:bCs w:val="false"/>
+                <w:color w:val="1A1A1A"/>
+                <w:sz w:val="18"/>
+                <w:szCs w:val="18"/>
+              </w:rPr>
+              <w:t xml:space="preserve">75,0%  (6 de 8)</w:t>
+            </w:r>
+          </w:p>
+        </w:tc>
+        <w:tc>
+          <w:tcPr>
+            <w:tcW w:type="pct" w:w="17%"/>
+            <w:tcBorders>
+              <w:top w:val="single" w:color="C9D2E3" w:sz="4"/>
+              <w:left w:val="single" w:color="C9D2E3" w:sz="4"/>
+              <w:bottom w:val="single" w:color="C9D2E3" w:sz="4"/>
+              <w:right w:val="single" w:color="C9D2E3" w:sz="4"/>
+            </w:tcBorders>
+            <w:tcMar>
+              <w:top w:type="dxa" w:w="50"/>
+              <w:left w:type="dxa" w:w="100"/>
+              <w:bottom w:type="dxa" w:w="50"/>
+              <w:right w:type="dxa" w:w="100"/>
+            </w:tcMar>
+          </w:tcPr>
+          <w:p>
+            <w:pPr>
+              <w:jc w:val="center"/>
+            </w:pPr>
+            <w:r>
+              <w:rPr>
+                <w:rFonts w:ascii="Exo 2" w:cs="Exo 2" w:eastAsia="Exo 2" w:hAnsi="Exo 2"/>
+                <w:b w:val="false"/>
+                <w:bCs w:val="false"/>
+                <w:color w:val="1A1A1A"/>
+                <w:sz w:val="18"/>
+                <w:szCs w:val="18"/>
+              </w:rPr>
+              <w:t xml:space="preserve">92,9%</w:t>
+            </w:r>
+          </w:p>
+        </w:tc>
+      </w:tr>
+      <w:tr>
+        <w:tc>
+          <w:tcPr>
+            <w:tcW w:type="pct" w:w="30%"/>
+            <w:tcBorders>
+              <w:top w:val="single" w:color="C9D2E3" w:sz="4"/>
+              <w:left w:val="single" w:color="C9D2E3" w:sz="4"/>
+              <w:bottom w:val="single" w:color="C9D2E3" w:sz="4"/>
+              <w:right w:val="single" w:color="C9D2E3" w:sz="4"/>
+            </w:tcBorders>
+            <w:tcMar>
+              <w:top w:type="dxa" w:w="50"/>
+              <w:left w:type="dxa" w:w="100"/>
+              <w:bottom w:type="dxa" w:w="50"/>
+              <w:right w:type="dxa" w:w="100"/>
+            </w:tcMar>
+          </w:tcPr>
+          <w:p>
+            <w:pPr>
+              <w:jc w:val="left"/>
+            </w:pPr>
+            <w:r>
+              <w:rPr>
+                <w:rFonts w:ascii="Exo 2" w:cs="Exo 2" w:eastAsia="Exo 2" w:hAnsi="Exo 2"/>
+                <w:b w:val="false"/>
+                <w:bCs w:val="false"/>
+                <w:color w:val="1A1A1A"/>
+                <w:sz w:val="18"/>
+                <w:szCs w:val="18"/>
+              </w:rPr>
+              <w:t xml:space="preserve">Reportar incidente</w:t>
+            </w:r>
+          </w:p>
+        </w:tc>
+        <w:tc>
+          <w:tcPr>
+            <w:tcW w:type="pct" w:w="13%"/>
+            <w:tcBorders>
+              <w:top w:val="single" w:color="C9D2E3" w:sz="4"/>
+              <w:left w:val="single" w:color="C9D2E3" w:sz="4"/>
+              <w:bottom w:val="single" w:color="C9D2E3" w:sz="4"/>
+              <w:right w:val="single" w:color="C9D2E3" w:sz="4"/>
+            </w:tcBorders>
+            <w:tcMar>
+              <w:top w:type="dxa" w:w="50"/>
+              <w:left w:type="dxa" w:w="100"/>
+              <w:bottom w:type="dxa" w:w="50"/>
+              <w:right w:type="dxa" w:w="100"/>
+            </w:tcMar>
+          </w:tcPr>
+          <w:p>
+            <w:pPr>
+              <w:jc w:val="center"/>
+            </w:pPr>
+            <w:r>
+              <w:rPr>
+                <w:rFonts w:ascii="Exo 2" w:cs="Exo 2" w:eastAsia="Exo 2" w:hAnsi="Exo 2"/>
+                <w:b w:val="false"/>
+                <w:bCs w:val="false"/>
+                <w:color w:val="1A1A1A"/>
+                <w:sz w:val="18"/>
+                <w:szCs w:val="18"/>
+              </w:rPr>
+              <w:t xml:space="preserve">4h / 24h</w:t>
+            </w:r>
+          </w:p>
+        </w:tc>
+        <w:tc>
+          <w:tcPr>
+            <w:tcW w:type="pct" w:w="23%"/>
+            <w:tcBorders>
+              <w:top w:val="single" w:color="C9D2E3" w:sz="4"/>
+              <w:left w:val="single" w:color="C9D2E3" w:sz="4"/>
+              <w:bottom w:val="single" w:color="C9D2E3" w:sz="4"/>
+              <w:right w:val="single" w:color="C9D2E3" w:sz="4"/>
+            </w:tcBorders>
+            <w:tcMar>
+              <w:top w:type="dxa" w:w="50"/>
+              <w:left w:type="dxa" w:w="100"/>
+              <w:bottom w:type="dxa" w:w="50"/>
+              <w:right w:type="dxa" w:w="100"/>
+            </w:tcMar>
+          </w:tcPr>
+          <w:p>
+            <w:pPr>
+              <w:jc w:val="left"/>
+            </w:pPr>
+            <w:r>
+              <w:rPr>
+                <w:rFonts w:ascii="Exo 2" w:cs="Exo 2" w:eastAsia="Exo 2" w:hAnsi="Exo 2"/>
+                <w:b w:val="false"/>
+                <w:bCs w:val="false"/>
+                <w:color w:val="1A1A1A"/>
+                <w:sz w:val="18"/>
+                <w:szCs w:val="18"/>
+              </w:rPr>
+              <w:t xml:space="preserve">5 recebidos · 4 concluídos · 1 em aberto</w:t>
+            </w:r>
+          </w:p>
+        </w:tc>
+        <w:tc>
+          <w:tcPr>
+            <w:tcW w:type="pct" w:w="17%"/>
+            <w:tcBorders>
+              <w:top w:val="single" w:color="C9D2E3" w:sz="4"/>
+              <w:left w:val="single" w:color="C9D2E3" w:sz="4"/>
+              <w:bottom w:val="single" w:color="C9D2E3" w:sz="4"/>
+              <w:right w:val="single" w:color="C9D2E3" w:sz="4"/>
+            </w:tcBorders>
+            <w:tcMar>
+              <w:top w:type="dxa" w:w="50"/>
+              <w:left w:type="dxa" w:w="100"/>
+              <w:bottom w:type="dxa" w:w="50"/>
+              <w:right w:type="dxa" w:w="100"/>
+            </w:tcMar>
+          </w:tcPr>
+          <w:p>
+            <w:pPr>
+              <w:jc w:val="center"/>
+            </w:pPr>
+            <w:r>
+              <w:rPr>
+                <w:rFonts w:ascii="Exo 2" w:cs="Exo 2" w:eastAsia="Exo 2" w:hAnsi="Exo 2"/>
+                <w:b w:val="false"/>
+                <w:bCs w:val="false"/>
+                <w:color w:val="1A1A1A"/>
+                <w:sz w:val="18"/>
+                <w:szCs w:val="18"/>
+              </w:rPr>
+              <w:t xml:space="preserve">75,0%  (3 de 4)</w:t>
+            </w:r>
+          </w:p>
+        </w:tc>
+        <w:tc>
+          <w:tcPr>
+            <w:tcW w:type="pct" w:w="17%"/>
+            <w:tcBorders>
+              <w:top w:val="single" w:color="C9D2E3" w:sz="4"/>
+              <w:left w:val="single" w:color="C9D2E3" w:sz="4"/>
+              <w:bottom w:val="single" w:color="C9D2E3" w:sz="4"/>
+              <w:right w:val="single" w:color="C9D2E3" w:sz="4"/>
+            </w:tcBorders>
+            <w:tcMar>
+              <w:top w:type="dxa" w:w="50"/>
+              <w:left w:type="dxa" w:w="100"/>
+              <w:bottom w:type="dxa" w:w="50"/>
+              <w:right w:type="dxa" w:w="100"/>
+            </w:tcMar>
+          </w:tcPr>
+          <w:p>
+            <w:pPr>
+              <w:jc w:val="center"/>
+            </w:pPr>
+            <w:r>
+              <w:rPr>
+                <w:rFonts w:ascii="Exo 2" w:cs="Exo 2" w:eastAsia="Exo 2" w:hAnsi="Exo 2"/>
+                <w:b w:val="false"/>
+                <w:bCs w:val="false"/>
+                <w:color w:val="1A1A1A"/>
+                <w:sz w:val="18"/>
+                <w:szCs w:val="18"/>
+              </w:rPr>
+              <w:t xml:space="preserve">100%</w:t>
+            </w:r>
+          </w:p>
+        </w:tc>
+      </w:tr>
+      <w:tr>
+        <w:tc>
+          <w:tcPr>
+            <w:tcW w:type="pct" w:w="30%"/>
+            <w:tcBorders>
+              <w:top w:val="single" w:color="C9D2E3" w:sz="4"/>
+              <w:left w:val="single" w:color="C9D2E3" w:sz="4"/>
+              <w:bottom w:val="single" w:color="C9D2E3" w:sz="4"/>
+              <w:right w:val="single" w:color="C9D2E3" w:sz="4"/>
+            </w:tcBorders>
+            <w:tcMar>
+              <w:top w:type="dxa" w:w="50"/>
+              <w:left w:type="dxa" w:w="100"/>
+              <w:bottom w:type="dxa" w:w="50"/>
+              <w:right w:type="dxa" w:w="100"/>
+            </w:tcMar>
+          </w:tcPr>
+          <w:p>
+            <w:pPr>
+              <w:jc w:val="left"/>
+            </w:pPr>
+            <w:r>
+              <w:rPr>
+                <w:rFonts w:ascii="Exo 2" w:cs="Exo 2" w:eastAsia="Exo 2" w:hAnsi="Exo 2"/>
+                <w:b/>
+                <w:bCs/>
+                <w:color w:val="1A1A1A"/>
+                <w:sz w:val="18"/>
+                <w:szCs w:val="18"/>
+              </w:rPr>
+              <w:t xml:space="preserve">Total do mês</w:t>
+            </w:r>
+          </w:p>
+        </w:tc>
+        <w:tc>
+          <w:tcPr>
+            <w:tcW w:type="pct" w:w="13%"/>
+            <w:tcBorders>
+              <w:top w:val="single" w:color="C9D2E3" w:sz="4"/>
+              <w:left w:val="single" w:color="C9D2E3" w:sz="4"/>
+              <w:bottom w:val="single" w:color="C9D2E3" w:sz="4"/>
+              <w:right w:val="single" w:color="C9D2E3" w:sz="4"/>
+            </w:tcBorders>
+            <w:tcMar>
+              <w:top w:type="dxa" w:w="50"/>
+              <w:left w:type="dxa" w:w="100"/>
+              <w:bottom w:type="dxa" w:w="50"/>
+              <w:right w:type="dxa" w:w="100"/>
+            </w:tcMar>
+          </w:tcPr>
+          <w:p>
+            <w:pPr>
+              <w:jc w:val="center"/>
+            </w:pPr>
+            <w:r>
+              <w:rPr>
+                <w:rFonts w:ascii="Exo 2" w:cs="Exo 2" w:eastAsia="Exo 2" w:hAnsi="Exo 2"/>
+                <w:b/>
+                <w:bCs/>
+                <w:color w:val="1A1A1A"/>
+                <w:sz w:val="18"/>
+                <w:szCs w:val="18"/>
+              </w:rPr>
+              <w:t xml:space="preserve">—</w:t>
+            </w:r>
+          </w:p>
+        </w:tc>
+        <w:tc>
+          <w:tcPr>
+            <w:tcW w:type="pct" w:w="23%"/>
+            <w:tcBorders>
+              <w:top w:val="single" w:color="C9D2E3" w:sz="4"/>
+              <w:left w:val="single" w:color="C9D2E3" w:sz="4"/>
+              <w:bottom w:val="single" w:color="C9D2E3" w:sz="4"/>
+              <w:right w:val="single" w:color="C9D2E3" w:sz="4"/>
+            </w:tcBorders>
+            <w:tcMar>
+              <w:top w:type="dxa" w:w="50"/>
+              <w:left w:type="dxa" w:w="100"/>
+              <w:bottom w:type="dxa" w:w="50"/>
+              <w:right w:type="dxa" w:w="100"/>
+            </w:tcMar>
+          </w:tcPr>
+          <w:p>
+            <w:pPr>
+              <w:jc w:val="left"/>
+            </w:pPr>
+            <w:r>
+              <w:rPr>
+                <w:rFonts w:ascii="Exo 2" w:cs="Exo 2" w:eastAsia="Exo 2" w:hAnsi="Exo 2"/>
+                <w:b/>
+                <w:bCs/>
+                <w:color w:val="1A1A1A"/>
+                <w:sz w:val="18"/>
+                <w:szCs w:val="18"/>
+              </w:rPr>
+              <w:t xml:space="preserve">45 recebidos · 33 concluídos · 12 em aberto</w:t>
+            </w:r>
+          </w:p>
+        </w:tc>
+        <w:tc>
+          <w:tcPr>
+            <w:tcW w:type="pct" w:w="17%"/>
+            <w:tcBorders>
+              <w:top w:val="single" w:color="C9D2E3" w:sz="4"/>
+              <w:left w:val="single" w:color="C9D2E3" w:sz="4"/>
+              <w:bottom w:val="single" w:color="C9D2E3" w:sz="4"/>
+              <w:right w:val="single" w:color="C9D2E3" w:sz="4"/>
+            </w:tcBorders>
+            <w:tcMar>
+              <w:top w:type="dxa" w:w="50"/>
+              <w:left w:type="dxa" w:w="100"/>
+              <w:bottom w:type="dxa" w:w="50"/>
+              <w:right w:type="dxa" w:w="100"/>
+            </w:tcMar>
+          </w:tcPr>
+          <w:p>
+            <w:pPr>
+              <w:jc w:val="center"/>
+            </w:pPr>
+            <w:r>
+              <w:rPr>
+                <w:rFonts w:ascii="Exo 2" w:cs="Exo 2" w:eastAsia="Exo 2" w:hAnsi="Exo 2"/>
+                <w:b/>
+                <w:bCs/>
+                <w:color w:val="1A1A1A"/>
+                <w:sz w:val="18"/>
+                <w:szCs w:val="18"/>
+              </w:rPr>
+              <w:t xml:space="preserve">81,8%  (27 de 33)</w:t>
+            </w:r>
+          </w:p>
+        </w:tc>
+        <w:tc>
+          <w:tcPr>
+            <w:tcW w:type="pct" w:w="17%"/>
+            <w:tcBorders>
+              <w:top w:val="single" w:color="C9D2E3" w:sz="4"/>
+              <w:left w:val="single" w:color="C9D2E3" w:sz="4"/>
+              <w:bottom w:val="single" w:color="C9D2E3" w:sz="4"/>
+              <w:right w:val="single" w:color="C9D2E3" w:sz="4"/>
+            </w:tcBorders>
+            <w:tcMar>
+              <w:top w:type="dxa" w:w="50"/>
+              <w:left w:type="dxa" w:w="100"/>
+              <w:bottom w:type="dxa" w:w="50"/>
+              <w:right w:type="dxa" w:w="100"/>
+            </w:tcMar>
+          </w:tcPr>
+          <w:p>
+            <w:pPr>
+              <w:jc w:val="center"/>
+            </w:pPr>
+            <w:r>
+              <w:rPr>
+                <w:rFonts w:ascii="Exo 2" w:cs="Exo 2" w:eastAsia="Exo 2" w:hAnsi="Exo 2"/>
+                <w:b/>
+                <w:bCs/>
+                <w:color w:val="1A1A1A"/>
+                <w:sz w:val="18"/>
+                <w:szCs w:val="18"/>
+              </w:rPr>
+              <w:t xml:space="preserve">97,7%</w:t>
+            </w:r>
+          </w:p>
+        </w:tc>
+      </w:tr>
+    </w:tbl>
+    <w:p>
+      <w:pPr>
+        <w:spacing w:after="120"/>
+        <w:jc w:val="both"/>
+      </w:pPr>
+      <w:r>
+        <w:rPr>
+          <w:rFonts w:ascii="Exo 2" w:cs="Exo 2" w:eastAsia="Exo 2" w:hAnsi="Exo 2"/>
+          <w:b/>
+          <w:bCs/>
+          <w:color w:val="1A1A1A"/>
+          <w:sz w:val="21"/>
+          <w:szCs w:val="21"/>
+        </w:rPr>
+        <w:t xml:space="preserve">Onde está o gargalo. </w:t>
+      </w:r>
+      <w:r>
+        <w:rPr>
+          <w:rFonts w:ascii="Exo 2" w:cs="Exo 2" w:eastAsia="Exo 2" w:hAnsi="Exo 2"/>
+          <w:color w:val="1A1A1A"/>
+          <w:sz w:val="21"/>
+          <w:szCs w:val="21"/>
+        </w:rPr>
+        <w:t xml:space="preserve">Comunicação Digital concentra os estouros do mês e tem quase metade dos chamados ainda em aberto (7 de 15), por depender de conteúdo e de definições das áreas solicitantes — o mesmo ponto levantado em Impactos. Solicitação de TI, a trilha de maior volume, responde 100% das primeiras respostas no prazo e resolve 85,7% dentro da meta.</w:t>
+      </w:r>
+    </w:p>
+    <w:p>
+      <w:pPr>
+        <w:spacing w:after="60"/>
+        <w:jc w:val="both"/>
+      </w:pPr>
+      <w:r>
+        <w:rPr>
+          <w:rFonts w:ascii="Exo 2" w:cs="Exo 2" w:eastAsia="Exo 2" w:hAnsi="Exo 2"/>
+          <w:b/>
+          <w:bCs/>
+          <w:color w:val="1A1A1A"/>
+          <w:sz w:val="18"/>
+          <w:szCs w:val="18"/>
+        </w:rPr>
+        <w:t xml:space="preserve">Como o SLA é apurado. </w:t>
+      </w:r>
+      <w:r>
+        <w:rPr>
+          <w:rFonts w:ascii="Exo 2" w:cs="Exo 2" w:eastAsia="Exo 2" w:hAnsi="Exo 2"/>
+          <w:color w:val="1A1A1A"/>
+          <w:sz w:val="18"/>
+          <w:szCs w:val="18"/>
+        </w:rPr>
+        <w:t xml:space="preserve">Lido dos campos oficiais do JSM (primeira resposta e resolução), em horário comercial, sem cálculo manual. A base é a coorte do mês: os 45 chamados abertos entre 01 e 31/08, sendo 42 deles dentro das janelas das duas sprints. O percentual de resolução considera apenas os 33 já concluídos; os chamados em aberto são declarados em cada frente, e não diluídos no índice. As metas são as réguas configuradas no próprio JSM.</w:t>
+      </w:r>
+    </w:p>
+    <w:p>
+      <w:pPr>
+        <w:spacing w:after="80"/>
+        <w:jc w:val="both"/>
+      </w:pPr>
+      <w:r>
+        <w:rPr>
+          <w:rFonts w:ascii="Exo 2" w:cs="Exo 2" w:eastAsia="Exo 2" w:hAnsi="Exo 2"/>
+          <w:b/>
+          <w:bCs/>
+          <w:color w:val="1A1A1A"/>
+          <w:sz w:val="18"/>
+          <w:szCs w:val="18"/>
+        </w:rPr>
+        <w:t xml:space="preserve">Revisão do fechamento anterior. </w:t>
+      </w:r>
+      <w:r>
+        <w:rPr>
+          <w:rFonts w:ascii="Exo 2" w:cs="Exo 2" w:eastAsia="Exo 2" w:hAnsi="Exo 2"/>
+          <w:color w:val="1A1A1A"/>
+          <w:sz w:val="18"/>
+          <w:szCs w:val="18"/>
+        </w:rPr>
+        <w:t xml:space="preserve">A evolução S16 → S17 desta edição foi recalculada nessa mesma régua. A leitura anterior (78% → 91%) comparava bases diferentes: o S16 vinha dos chamados resolvidos na janela e o S17 da coorte da sprint. Na base única, o S16 fica em 72% e o ganho real do mês é de +20 p.p., não +13 p.p.</w:t>
+      </w:r>
+    </w:p>
+    <w:p>
+      <w:pPr>
+        <w:shd w:fill="002060" w:val="clear"/>
+        <w:spacing w:after="90" w:before="190"/>
+      </w:pPr>
+      <w:r>
+        <w:rPr>
+          <w:rFonts w:ascii="Exo 2" w:cs="Exo 2" w:eastAsia="Exo 2" w:hAnsi="Exo 2"/>
+          <w:b/>
+          <w:bCs/>
+          <w:color w:val="FFFFFF"/>
+          <w:sz w:val="21"/>
+          <w:szCs w:val="21"/>
+        </w:rPr>
         <w:t xml:space="preserve">  Marcos que movem o ponteiro</w:t>
       </w:r>
     </w:p>
@@ -1343,7 +2283,7 @@
           <w:sz w:val="15"/>
           <w:szCs w:val="15"/>
         </w:rPr>
-        <w:t xml:space="preserve">Números apurados no board das sprints (Jira) e no campo oficial de SLA do Service Desk.</w:t>
+        <w:t xml:space="preserve">Números apurados no board das sprints (Jira) e nos campos oficiais de SLA do Service Desk (JSM), sobre a coorte de chamados abertos entre 01 e 31/08/2026.</w:t>
       </w:r>
     </w:p>
     <w:sectPr>

</xml_diff>

<commit_message>
Corrige a regua de SLA: chamado vencido e ainda aberto conta como estouro
A apuracao anterior lia apenas completedCycles, entao chamados que ja
tinham vencido a meta mas seguiam abertos ficavam fora da conta. Sao 7 dos
13 estouros do mes, e a omissao inflava o indice. A regua passa a usar
tambem ongoingCycle.breached, e o denominador vira os chamados com
veredito (no prazo + estouro), com os em curso declarados a parte.

Tambem fixa a regua global do JSM (4h/24h, 56h em Comunicacao Digital)
como a oficial: incidentes tem uma regua propria mais rigida (2h/8h)
configurada em paralelo, mas a decisao registrada nos dashboards e medir
todos pela global.

Mes: resolucao 67,5% (27 de 40) e 1a resposta 95,6% (43 de 45).
Evolucao: resolucao 59% -> 80% (+21 p.p.), 1a resposta 91% -> 100% (+9 p.p.).
Painel e documento atualizados juntos.

Co-Authored-By: Claude Opus 5 (1M context) <noreply@anthropic.com>
</commit_message>
<xml_diff>
--- a/agosto-2026/Report_Mensal_TI_Agosto_2026.docx
+++ b/agosto-2026/Report_Mensal_TI_Agosto_2026.docx
@@ -843,7 +843,7 @@
                 <w:sz w:val="18"/>
                 <w:szCs w:val="18"/>
               </w:rPr>
-              <w:t xml:space="preserve">95%</w:t>
+              <w:t xml:space="preserve">91%</w:t>
             </w:r>
           </w:p>
         </w:tc>
@@ -909,7 +909,7 @@
                 <w:sz w:val="18"/>
                 <w:szCs w:val="18"/>
               </w:rPr>
-              <w:t xml:space="preserve">▲ +5 p.p.</w:t>
+              <w:t xml:space="preserve">▲ +9 p.p.</w:t>
             </w:r>
           </w:p>
         </w:tc>
@@ -977,7 +977,7 @@
                 <w:sz w:val="18"/>
                 <w:szCs w:val="18"/>
               </w:rPr>
-              <w:t xml:space="preserve">72%</w:t>
+              <w:t xml:space="preserve">59%</w:t>
             </w:r>
           </w:p>
         </w:tc>
@@ -1010,7 +1010,7 @@
                 <w:sz w:val="18"/>
                 <w:szCs w:val="18"/>
               </w:rPr>
-              <w:t xml:space="preserve">92%</w:t>
+              <w:t xml:space="preserve">80%</w:t>
             </w:r>
           </w:p>
         </w:tc>
@@ -1043,7 +1043,7 @@
                 <w:sz w:val="18"/>
                 <w:szCs w:val="18"/>
               </w:rPr>
-              <w:t xml:space="preserve">▲ +20 p.p.</w:t>
+              <w:t xml:space="preserve">▲ +21 p.p.</w:t>
             </w:r>
           </w:p>
         </w:tc>
@@ -1066,7 +1066,7 @@
           <w:sz w:val="21"/>
           <w:szCs w:val="21"/>
         </w:rPr>
-        <w:t xml:space="preserve">A leitura estratégica: a Tecnologia aumentou a capacidade de entrega (mais itens concluídos) e, ao mesmo tempo, elevou a qualidade do atendimento (SLA de resolução de 72% para 92%). Crescer volume e qualidade juntos é sinal de maturidade operacional, não de esforço pontual.</w:t>
+        <w:t xml:space="preserve">A leitura estratégica: a Tecnologia aumentou a capacidade de entrega (mais itens concluídos) e, ao mesmo tempo, elevou a qualidade do atendimento (SLA de resolução de 59% para 80%). Crescer volume e qualidade juntos é sinal de maturidade operacional, não de esforço pontual.</w:t>
       </w:r>
     </w:p>
     <w:p>
@@ -1201,7 +1201,7 @@
                 <w:sz w:val="17"/>
                 <w:szCs w:val="17"/>
               </w:rPr>
-              <w:t xml:space="preserve">Chamados</w:t>
+              <w:t xml:space="preserve">Chamados (veredito)</w:t>
             </w:r>
           </w:p>
         </w:tc>
@@ -1358,7 +1358,7 @@
                 <w:sz w:val="18"/>
                 <w:szCs w:val="18"/>
               </w:rPr>
-              <w:t xml:space="preserve">25 recebidos · 21 concluídos · 4 em aberto</w:t>
+              <w:t xml:space="preserve">25 recebidos · 18 no prazo · 6 estouros · 1 em curso</w:t>
             </w:r>
           </w:p>
         </w:tc>
@@ -1391,7 +1391,7 @@
                 <w:sz w:val="18"/>
                 <w:szCs w:val="18"/>
               </w:rPr>
-              <w:t xml:space="preserve">85,7%  (18 de 21)</w:t>
+              <w:t xml:space="preserve">75,0%  (18 de 24)</w:t>
             </w:r>
           </w:p>
         </w:tc>
@@ -1525,7 +1525,7 @@
                 <w:sz w:val="18"/>
                 <w:szCs w:val="18"/>
               </w:rPr>
-              <w:t xml:space="preserve">15 recebidos · 8 concluídos · 7 em aberto</w:t>
+              <w:t xml:space="preserve">15 recebidos · 6 no prazo · 6 estouros · 3 em curso</w:t>
             </w:r>
           </w:p>
         </w:tc>
@@ -1558,7 +1558,7 @@
                 <w:sz w:val="18"/>
                 <w:szCs w:val="18"/>
               </w:rPr>
-              <w:t xml:space="preserve">75,0%  (6 de 8)</w:t>
+              <w:t xml:space="preserve">50,0%  (6 de 12)</w:t>
             </w:r>
           </w:p>
         </w:tc>
@@ -1591,7 +1591,7 @@
                 <w:sz w:val="18"/>
                 <w:szCs w:val="18"/>
               </w:rPr>
-              <w:t xml:space="preserve">92,9%</w:t>
+              <w:t xml:space="preserve">86,7%</w:t>
             </w:r>
           </w:p>
         </w:tc>
@@ -1692,7 +1692,7 @@
                 <w:sz w:val="18"/>
                 <w:szCs w:val="18"/>
               </w:rPr>
-              <w:t xml:space="preserve">5 recebidos · 4 concluídos · 1 em aberto</w:t>
+              <w:t xml:space="preserve">5 recebidos · 3 no prazo · 1 estouro · 1 em curso</w:t>
             </w:r>
           </w:p>
         </w:tc>
@@ -1859,7 +1859,7 @@
                 <w:sz w:val="18"/>
                 <w:szCs w:val="18"/>
               </w:rPr>
-              <w:t xml:space="preserve">45 recebidos · 33 concluídos · 12 em aberto</w:t>
+              <w:t xml:space="preserve">45 recebidos · 27 no prazo · 13 estouros · 5 em curso</w:t>
             </w:r>
           </w:p>
         </w:tc>
@@ -1892,7 +1892,7 @@
                 <w:sz w:val="18"/>
                 <w:szCs w:val="18"/>
               </w:rPr>
-              <w:t xml:space="preserve">81,8%  (27 de 33)</w:t>
+              <w:t xml:space="preserve">67,5%  (27 de 40)</w:t>
             </w:r>
           </w:p>
         </w:tc>
@@ -1925,7 +1925,7 @@
                 <w:sz w:val="18"/>
                 <w:szCs w:val="18"/>
               </w:rPr>
-              <w:t xml:space="preserve">97,7%</w:t>
+              <w:t xml:space="preserve">95,6%</w:t>
             </w:r>
           </w:p>
         </w:tc>
@@ -1954,7 +1954,7 @@
           <w:sz w:val="21"/>
           <w:szCs w:val="21"/>
         </w:rPr>
-        <w:t xml:space="preserve">Comunicação Digital concentra os estouros do mês e tem quase metade dos chamados ainda em aberto (7 de 15), por depender de conteúdo e de definições das áreas solicitantes — o mesmo ponto levantado em Impactos. Solicitação de TI, a trilha de maior volume, responde 100% das primeiras respostas no prazo e resolve 85,7% dentro da meta.</w:t>
+        <w:t xml:space="preserve">Comunicação Digital resolve no prazo apenas metade do que recebe e responde por 6 dos 13 estouros do mês, por depender de conteúdo e de definições das áreas solicitantes — o mesmo ponto levantado em Impactos. Solicitação de TI, a trilha de maior volume, mantém 100% das primeiras respostas no prazo e resolve 75% dentro da meta. A tendência do mês é de recuperação: a resolução saiu de 59% no S16 para 80% no S17.</w:t>
       </w:r>
     </w:p>
     <w:p>
@@ -1980,7 +1980,7 @@
           <w:sz w:val="18"/>
           <w:szCs w:val="18"/>
         </w:rPr>
-        <w:t xml:space="preserve">Lido dos campos oficiais do JSM (primeira resposta e resolução), em horário comercial, sem cálculo manual. A base é a coorte do mês: os 45 chamados abertos entre 01 e 31/08, sendo 42 deles dentro das janelas das duas sprints. O percentual de resolução considera apenas os 33 já concluídos; os chamados em aberto são declarados em cada frente, e não diluídos no índice. As metas são as réguas configuradas no próprio JSM.</w:t>
+        <w:t xml:space="preserve">Lido da régua global do JSM (primeira resposta e resolução), em horário comercial, sem cálculo manual. Metas: 4h de primeira resposta em todas as frentes; resolução em 24h, e 56h em Comunicação Digital por depender de conteúdo. Incidentes têm régua própria mais rígida no JSM (2h/8h), mas a decisão vigente é medir todos pela régua global. A base é a coorte do mês: os 45 chamados abertos entre 01 e 31/08, sendo 42 deles dentro das janelas das duas sprints. Cada chamado recebe um veredito: no prazo (concluído dentro da meta), estouro (meta vencida, esteja o chamado concluído ou ainda aberto) ou em curso (aberto e ainda dentro da meta). O índice usa os 40 chamados com veredito; os 5 em curso ficam declarados, não diluídos.</w:t>
       </w:r>
     </w:p>
     <w:p>
@@ -2006,7 +2006,7 @@
           <w:sz w:val="18"/>
           <w:szCs w:val="18"/>
         </w:rPr>
-        <w:t xml:space="preserve">A evolução S16 → S17 desta edição foi recalculada nessa mesma régua. A leitura anterior (78% → 91%) comparava bases diferentes: o S16 vinha dos chamados resolvidos na janela e o S17 da coorte da sprint. Na base única, o S16 fica em 72% e o ganho real do mês é de +20 p.p., não +13 p.p.</w:t>
+        <w:t xml:space="preserve">A evolução S16 → S17 foi recalculada nessa régua. A leitura enviada por e-mail (78% → 91%, +13 p.p.) comparava bases diferentes e não contava como estouro o chamado que já venceu a meta mas segue aberto — são 7 dos 13 estouros do mês. Na régua única, o S16 fica em 59% e o S17 em 80%: o ganho real é de +21 p.p., sobre patamares mais baixos do que se supunha. A primeira resposta se confirma em 91% → 100%. Os dashboards das sprints S16 e S17 foram reapurados na mesma régua.</w:t>
       </w:r>
     </w:p>
     <w:p>

</xml_diff>